<commit_message>
Expand literature review to 17 sources with read-depth noted
Co-Authored-By: Claude Sonnet 5.5 <noreply@anthropic.com>
Claude-Session: https://claude.ai/code/session_01PXyVqdKG827WeN1ceWaNxA
</commit_message>
<xml_diff>
--- a/docs/literature_review.docx
+++ b/docs/literature_review.docx
@@ -12,7 +12,7 @@
     </w:p>
     <w:p>
       <w:r>
-        <w:t>Neighbourhood-aware misbehavior detection for V2X (VeReMi Extension benchmark). Rows marked [secondary] are known only through the 2025 survey (row 3) and have NOT been read in the original; verify before citing.</w:t>
+        <w:t>Neighbourhood-aware misbehavior detection for V2X (VeReMi Extension benchmark). 17 sources. The first column states how much of each I actually read: most rows are from the abstract only, so verify details against the full paper before citing. Rows marked (secondary) or search-only are known second-hand.</w:t>
       </w:r>
     </w:p>
     <w:tbl>
@@ -168,7 +168,7 @@
           </w:tcPr>
           <w:p>
             <w:r>
-              <w:t>Conference paper; dataset</w:t>
+              <w:t>1. VeReMi dataset paper. Read: full text</w:t>
             </w:r>
           </w:p>
         </w:tc>
@@ -178,7 +178,7 @@
           </w:tcPr>
           <w:p>
             <w:r>
-              <w:t>R. W. van der Heijden, T. Lukaseder, F. Kargl, 2018. SecureComm (VeReMi)</w:t>
+              <w:t>R. W. van der Heijden, T. Lukaseder, F. Kargl, 2018. SecureComm (arXiv 1804.06701)</w:t>
             </w:r>
           </w:p>
         </w:tc>
@@ -198,7 +198,7 @@
           </w:tcPr>
           <w:p>
             <w:r>
-              <w:t>LuST traffic scenario simulated with VEINS/SUMO; precision-recall evaluation; Gini-index dispersion of errors.</w:t>
+              <w:t>LuST scenario simulated with VEINS/SUMO; precision-recall evaluation; Gini-index dispersion of errors.</w:t>
             </w:r>
           </w:p>
         </w:tc>
@@ -208,7 +208,7 @@
           </w:tcPr>
           <w:p>
             <w:r>
-              <w:t>Quantitative. 225 simulation runs, 3 densities (35-39, 97-108, 491-519 vehicles), 5 position attacks, attacker share up to 30%. Rule-based detectors compared (ART, SAW, SSC, DMV, Maat).</w:t>
+              <w:t>Quantitative. 225 simulation runs, 3 densities (35-39, 97-108, 491-519 vehicles), 5 position attacks, up to 30% attackers. Rule-based detectors compared (ART, SAW, SSC, DMV, Maat).</w:t>
             </w:r>
           </w:p>
         </w:tc>
@@ -228,7 +228,7 @@
           </w:tcPr>
           <w:p>
             <w:r>
-              <w:t>Results given as PR graphs, no single score. Rule-based detectors only. Attackers act independently. Simulated traffic.</w:t>
+              <w:t>Results are PR graphs with no single score. Rule-based detectors only. Independent attackers. Simulated traffic.</w:t>
             </w:r>
           </w:p>
         </w:tc>
@@ -238,7 +238,7 @@
           </w:tcPr>
           <w:p>
             <w:r>
-              <w:t>Origin of the benchmark we build on. Its detectors judge messages one by one; our model adds neighbour context and a learned decision.</w:t>
+              <w:t>Origin of the benchmark we build on. Its detectors judge messages one by one; ours adds neighbour context and a learned decision.</w:t>
             </w:r>
           </w:p>
         </w:tc>
@@ -250,7 +250,7 @@
           </w:tcPr>
           <w:p>
             <w:r>
-              <w:t>Conference paper; dataset</w:t>
+              <w:t>2. VeReMi Extension dataset paper. Read: search summary and dataset README only</w:t>
             </w:r>
           </w:p>
         </w:tc>
@@ -260,7 +260,7 @@
           </w:tcPr>
           <w:p>
             <w:r>
-              <w:t>J. Kamel, R. W. van der Heijden et al., 2020. IEEE ICC (VeReMi Extension)</w:t>
+              <w:t>J. Kamel, R. W. van der Heijden et al., 2020. IEEE ICC</w:t>
             </w:r>
           </w:p>
         </w:tc>
@@ -290,7 +290,7 @@
           </w:tcPr>
           <w:p>
             <w:r>
-              <w:t>Quantitative. ~20 attack types (position and speed attacks, delayed messages, replay, DoS, Sybil, eventual stop), two time slots (07-09 h, 14-16 h), plus a full-day mixed set.</w:t>
+              <w:t>Quantitative. About 20 attack types (position, speed, delay, replay, DoS, Sybil, eventual stop), two time slots (07-09 h, 14-16 h), plus a full-day mixed set.</w:t>
             </w:r>
           </w:p>
         </w:tc>
@@ -300,7 +300,7 @@
           </w:tcPr>
           <w:p>
             <w:r>
-              <w:t>Provides a broader, comparable benchmark and baseline detector results.</w:t>
+              <w:t>A broader, comparable benchmark with baseline detector results.</w:t>
             </w:r>
           </w:p>
         </w:tc>
@@ -310,7 +310,7 @@
           </w:tcPr>
           <w:p>
             <w:r>
-              <w:t>I could not open the paper's results tables, so its benchmark numbers are unverified. Still simulated, not field data.</w:t>
+              <w:t>I could not open the paper's results tables, so its benchmark numbers are unverified. Simulated, not field data.</w:t>
             </w:r>
           </w:p>
         </w:tc>
@@ -320,7 +320,7 @@
           </w:tcPr>
           <w:p>
             <w:r>
-              <w:t>The dataset we evaluate on (RandomPos and ConstSpeed so far; about 18 more attack types available).</w:t>
+              <w:t>The dataset we evaluate on (RandomPos and ConstSpeed so far).</w:t>
             </w:r>
           </w:p>
         </w:tc>
@@ -332,7 +332,89 @@
           </w:tcPr>
           <w:p>
             <w:r>
-              <w:t>Journal survey</w:t>
+              <w:t>3. VeReMi NextGen dataset. Read: Zenodo record page and a search listing</w:t>
+            </w:r>
+          </w:p>
+        </w:tc>
+        <w:tc>
+          <w:tcPr>
+            <w:tcW w:type="dxa" w:w="2160"/>
+          </w:tcPr>
+          <w:p>
+            <w:r>
+              <w:t>A. Hermann, J.-N. Remmers, D. Eisermann, B. Erb, F. Kargl, 2026 (Zenodo; VNC 2026 per listing)</w:t>
+            </w:r>
+          </w:p>
+        </w:tc>
+        <w:tc>
+          <w:tcPr>
+            <w:tcW w:type="dxa" w:w="2304"/>
+          </w:tcPr>
+          <w:p>
+            <w:r>
+              <w:t>Extend VeReMi and VeReMi Extension with more attack types, driver profiles and an up-to-date traffic scenario.</w:t>
+            </w:r>
+          </w:p>
+        </w:tc>
+        <w:tc>
+          <w:tcPr>
+            <w:tcW w:type="dxa" w:w="2304"/>
+          </w:tcPr>
+          <w:p>
+            <w:r>
+              <w:t>InTAS traffic scenario with Eclipse MOSAIC; train/validation/test splits for ML detectors.</w:t>
+            </w:r>
+          </w:p>
+        </w:tc>
+        <w:tc>
+          <w:tcPr>
+            <w:tcW w:type="dxa" w:w="2880"/>
+          </w:tcPr>
+          <w:p>
+            <w:r>
+              <w:t>Quantitative dataset. Per the listing: urban and highway, 3 driver profiles, 15 attack types.</w:t>
+            </w:r>
+          </w:p>
+        </w:tc>
+        <w:tc>
+          <w:tcPr>
+            <w:tcW w:type="dxa" w:w="2880"/>
+          </w:tcPr>
+          <w:p>
+            <w:r>
+              <w:t>Per the listing, its attacks are harder to detect than VeReMi Extension's with a state-of-the-art detector.</w:t>
+            </w:r>
+          </w:p>
+        </w:tc>
+        <w:tc>
+          <w:tcPr>
+            <w:tcW w:type="dxa" w:w="2592"/>
+          </w:tcPr>
+          <w:p>
+            <w:r>
+              <w:t>Detection results not read. A forthcoming paper per the listing.</w:t>
+            </w:r>
+          </w:p>
+        </w:tc>
+        <w:tc>
+          <w:tcPr>
+            <w:tcW w:type="dxa" w:w="2160"/>
+          </w:tcPr>
+          <w:p>
+            <w:r>
+              <w:t>Next dataset to test on, to check our results hold beyond Extension.</w:t>
+            </w:r>
+          </w:p>
+        </w:tc>
+      </w:tr>
+      <w:tr>
+        <w:tc>
+          <w:tcPr>
+            <w:tcW w:type="dxa" w:w="1440"/>
+          </w:tcPr>
+          <w:p>
+            <w:r>
+              <w:t>4. Survey of V2X intrusion detection. Read: full text (searched)</w:t>
             </w:r>
           </w:p>
         </w:tc>
@@ -352,7 +434,7 @@
           </w:tcPr>
           <w:p>
             <w:r>
-              <w:t>Survey ML, federated learning and edge AI for V2X intrusion detection; benchmark datasets and gaps.</w:t>
+              <w:t>Survey ML, federated learning and edge AI for V2X intrusion detection, datasets and gaps.</w:t>
             </w:r>
           </w:p>
         </w:tc>
@@ -382,7 +464,7 @@
           </w:tcPr>
           <w:p>
             <w:r>
-              <w:t>Cooperative detectors often assume an honest majority and fail against collusion. Existing datasets lack attack diversity and real-world data.</w:t>
+              <w:t>Cooperative detectors often assume an honest majority and fail against collusion. Datasets lack attack diversity and real-world data.</w:t>
             </w:r>
           </w:p>
         </w:tc>
@@ -392,7 +474,7 @@
           </w:tcPr>
           <w:p>
             <w:r>
-              <w:t>Describes VeReMi as a hybrid of real and synthetic data, which is wrong: VeReMi is fully simulated. No per-dataset comparison tables I could read.</w:t>
+              <w:t>Wrongly describes VeReMi as a mix of real and synthetic data; it is fully simulated. No per-dataset result tables I could read.</w:t>
             </w:r>
           </w:p>
         </w:tc>
@@ -402,7 +484,7 @@
           </w:tcPr>
           <w:p>
             <w:r>
-              <w:t>Motivates our malicious-neighbour test and our metric set (including latency). Use for context only, not for numbers.</w:t>
+              <w:t>Motivates our malicious-neighbour test and our metric set including latency.</w:t>
             </w:r>
           </w:p>
         </w:tc>
@@ -414,7 +496,7 @@
           </w:tcPr>
           <w:p>
             <w:r>
-              <w:t>Journal/conf. paper [secondary]</w:t>
+              <w:t>5. AttentionGuard (platoons). Read: arXiv abstract</w:t>
             </w:r>
           </w:p>
         </w:tc>
@@ -424,7 +506,7 @@
           </w:tcPr>
           <w:p>
             <w:r>
-              <w:t>Gyawali, Qian, Hu, cited in the survey</w:t>
+              <w:t>H. Li, K. Kalogiannis, A. M. Hussain, P. Papadimitratos, 2025. ACM WiseML 2025 (arXiv 2505.10273)</w:t>
             </w:r>
           </w:p>
         </w:tc>
@@ -434,7 +516,7 @@
           </w:tcPr>
           <w:p>
             <w:r>
-              <w:t>Detect internal attackers in V2X using ML plus reputation scores.</w:t>
+              <w:t>Detect insider falsification in vehicle platoons.</w:t>
             </w:r>
           </w:p>
         </w:tc>
@@ -444,7 +526,7 @@
           </w:tcPr>
           <w:p>
             <w:r>
-              <w:t>ML classification combined with Dempster-Shafer reputation, synchronised with a Certificate Authority.</w:t>
+              <w:t>Multi-head transformer encoder over sequential kinematic data.</w:t>
             </w:r>
           </w:p>
         </w:tc>
@@ -454,7 +536,7 @@
           </w:tcPr>
           <w:p>
             <w:r>
-              <w:t>Quantitative. Sample size not given in the survey.</w:t>
+              <w:t>Quantitative, simulated platoon data: constant, gradual and combined falsification; varied controllers, speeds, attacker positions; steady-state, join and exit. Dataset size not stated on the page.</w:t>
             </w:r>
           </w:p>
         </w:tc>
@@ -464,7 +546,7 @@
           </w:tcPr>
           <w:p>
             <w:r>
-              <w:t>Survey reports F1 = 98% for positional attacks.</w:t>
+              <w:t>Up to 0.95 F1; 100 ms decision interval, suitable for real time.</w:t>
             </w:r>
           </w:p>
         </w:tc>
@@ -474,7 +556,827 @@
           </w:tcPr>
           <w:p>
             <w:r>
-              <w:t>Not read in the original. Dataset split and setup unknown to me.</w:t>
+              <w:t>Not stated in the abstract (full paper not read).</w:t>
+            </w:r>
+          </w:p>
+        </w:tc>
+        <w:tc>
+          <w:tcPr>
+            <w:tcW w:type="dxa" w:w="2160"/>
+          </w:tcPr>
+          <w:p>
+            <w:r>
+              <w:t>Transformers work on kinematic sequences, as in our model; it targets platoons, not general V2X broadcast, and has no neighbour-level attention.</w:t>
+            </w:r>
+          </w:p>
+        </w:tc>
+      </w:tr>
+      <w:tr>
+        <w:tc>
+          <w:tcPr>
+            <w:tcW w:type="dxa" w:w="1440"/>
+          </w:tcPr>
+          <w:p>
+            <w:r>
+              <w:t>6. PAMPOS (attack-agnostic). Read: arXiv abstract</w:t>
+            </w:r>
+          </w:p>
+        </w:tc>
+        <w:tc>
+          <w:tcPr>
+            <w:tcW w:type="dxa" w:w="2160"/>
+          </w:tcPr>
+          <w:p>
+            <w:r>
+              <w:t>K. Kalogiannis, A. M. Hussain, P. Papadimitratos, 2026. ACM WiseML 2026 (arXiv 2605.06833)</w:t>
+            </w:r>
+          </w:p>
+        </w:tc>
+        <w:tc>
+          <w:tcPr>
+            <w:tcW w:type="dxa" w:w="2304"/>
+          </w:tcPr>
+          <w:p>
+            <w:r>
+              <w:t>Detect unseen falsification attacks without attack-labelled training data.</w:t>
+            </w:r>
+          </w:p>
+        </w:tc>
+        <w:tc>
+          <w:tcPr>
+            <w:tcW w:type="dxa" w:w="2304"/>
+          </w:tcPr>
+          <w:p>
+            <w:r>
+              <w:t>Causal transformer decoder trained on benign trajectories; deviation from next-step prediction flags misbehavior; top-K anomaly score localises the falsified feature.</w:t>
+            </w:r>
+          </w:p>
+        </w:tc>
+        <w:tc>
+          <w:tcPr>
+            <w:tcW w:type="dxa" w:w="2880"/>
+          </w:tcPr>
+          <w:p>
+            <w:r>
+              <w:t>Quantitative on VeReMi++ (as named on its page), benign training only, 19 attack types, rush-hour and afternoon. Sample sizes not stated.</w:t>
+            </w:r>
+          </w:p>
+        </w:tc>
+        <w:tc>
+          <w:tcPr>
+            <w:tcW w:type="dxa" w:w="2880"/>
+          </w:tcPr>
+          <w:p>
+            <w:r>
+              <w:t>AUC up to 0.98 and F1 up to 0.95 on most attack categories.</w:t>
+            </w:r>
+          </w:p>
+        </w:tc>
+        <w:tc>
+          <w:tcPr>
+            <w:tcW w:type="dxa" w:w="2592"/>
+          </w:tcPr>
+          <w:p>
+            <w:r>
+              <w:t>Not stated in the abstract (full paper not read).</w:t>
+            </w:r>
+          </w:p>
+        </w:tc>
+        <w:tc>
+          <w:tcPr>
+            <w:tcW w:type="dxa" w:w="2160"/>
+          </w:tcPr>
+          <w:p>
+            <w:r>
+              <w:t>Complements us: unsupervised and attack-agnostic, where ours is supervised. Our F1 (0.982) is on 2 attacks, theirs on 19, so not comparable.</w:t>
+            </w:r>
+          </w:p>
+        </w:tc>
+      </w:tr>
+      <w:tr>
+        <w:tc>
+          <w:tcPr>
+            <w:tcW w:type="dxa" w:w="1440"/>
+          </w:tcPr>
+          <w:p>
+            <w:r>
+              <w:t>7. MistralBSM (LLM detector). Read: arXiv abstract</w:t>
+            </w:r>
+          </w:p>
+        </w:tc>
+        <w:tc>
+          <w:tcPr>
+            <w:tcW w:type="dxa" w:w="2160"/>
+          </w:tcPr>
+          <w:p>
+            <w:r>
+              <w:t>W. Hamhoum, S. Cherkaoui, 2024 (v2 2025). arXiv 2407.18462 preprint</w:t>
+            </w:r>
+          </w:p>
+        </w:tc>
+        <w:tc>
+          <w:tcPr>
+            <w:tcW w:type="dxa" w:w="2304"/>
+          </w:tcPr>
+          <w:p>
+            <w:r>
+              <w:t>Misbehavior detection using a large language model in an edge-cloud framework.</w:t>
+            </w:r>
+          </w:p>
+        </w:tc>
+        <w:tc>
+          <w:tcPr>
+            <w:tcW w:type="dxa" w:w="2304"/>
+          </w:tcPr>
+          <w:p>
+            <w:r>
+              <w:t>Fine-tuned Mistral-7B at the edge (0.012% of parameters trained) with a larger cloud LLM to validate.</w:t>
+            </w:r>
+          </w:p>
+        </w:tc>
+        <w:tc>
+          <w:tcPr>
+            <w:tcW w:type="dxa" w:w="2880"/>
+          </w:tcPr>
+          <w:p>
+            <w:r>
+              <w:t>Quantitative on VeReMi BSM sequences, a selected attack set; baselines LLAMA2-7B and RoBERTa. Sample sizes not stated.</w:t>
+            </w:r>
+          </w:p>
+        </w:tc>
+        <w:tc>
+          <w:tcPr>
+            <w:tcW w:type="dxa" w:w="2880"/>
+          </w:tcPr>
+          <w:p>
+            <w:r>
+              <w:t>98% accuracy (binary) and 96% (multiclass); reported to beat LLAMA2-7B and RoBERTa, but no baseline numbers on the page.</w:t>
+            </w:r>
+          </w:p>
+        </w:tc>
+        <w:tc>
+          <w:tcPr>
+            <w:tcW w:type="dxa" w:w="2592"/>
+          </w:tcPr>
+          <w:p>
+            <w:r>
+              <w:t>Not stated in the abstract (full paper not read).</w:t>
+            </w:r>
+          </w:p>
+        </w:tc>
+        <w:tc>
+          <w:tcPr>
+            <w:tcW w:type="dxa" w:w="2160"/>
+          </w:tcPr>
+          <w:p>
+            <w:r>
+              <w:t>Reports accuracy only, which hides class imbalance; we report precision, recall, false-positive rate and latency. Heavy model compared with ours (about 0.6 MB).</w:t>
+            </w:r>
+          </w:p>
+        </w:tc>
+      </w:tr>
+      <w:tr>
+        <w:tc>
+          <w:tcPr>
+            <w:tcW w:type="dxa" w:w="1440"/>
+          </w:tcPr>
+          <w:p>
+            <w:r>
+              <w:t>8. Federated VAE + GMM. Read: arXiv abstract</w:t>
+            </w:r>
+          </w:p>
+        </w:tc>
+        <w:tc>
+          <w:tcPr>
+            <w:tcW w:type="dxa" w:w="2160"/>
+          </w:tcPr>
+          <w:p>
+            <w:r>
+              <w:t>E. Mármol Campos, A. González Vidal, J. L. Hernández Ramos, A. Skarmeta, 2024. arXiv 2405.09903 preprint</w:t>
+            </w:r>
+          </w:p>
+        </w:tc>
+        <w:tc>
+          <w:tcPr>
+            <w:tcW w:type="dxa" w:w="2304"/>
+          </w:tcPr>
+          <w:p>
+            <w:r>
+              <w:t>Unsupervised federated detection of misbehavior that works without labels and can find unknown threats.</w:t>
+            </w:r>
+          </w:p>
+        </w:tc>
+        <w:tc>
+          <w:tcPr>
+            <w:tcW w:type="dxa" w:w="2304"/>
+          </w:tcPr>
+          <w:p>
+            <w:r>
+              <w:t>Variational autoencoders and Gaussian mixture models with RBM pre-training; Fedplus aggregation.</w:t>
+            </w:r>
+          </w:p>
+        </w:tc>
+        <w:tc>
+          <w:tcPr>
+            <w:tcW w:type="dxa" w:w="2880"/>
+          </w:tcPr>
+          <w:p>
+            <w:r>
+              <w:t>Quantitative on VeReMi; each vehicle trains on its own data. Attacks and sample sizes not stated.</w:t>
+            </w:r>
+          </w:p>
+        </w:tc>
+        <w:tc>
+          <w:tcPr>
+            <w:tcW w:type="dxa" w:w="2880"/>
+          </w:tcPr>
+          <w:p>
+            <w:r>
+              <w:t>More than 80% performance, better than recent proposals (no more exact figure on the page).</w:t>
+            </w:r>
+          </w:p>
+        </w:tc>
+        <w:tc>
+          <w:tcPr>
+            <w:tcW w:type="dxa" w:w="2592"/>
+          </w:tcPr>
+          <w:p>
+            <w:r>
+              <w:t>Not stated in the abstract (full paper not read).</w:t>
+            </w:r>
+          </w:p>
+        </w:tc>
+        <w:tc>
+          <w:tcPr>
+            <w:tcW w:type="dxa" w:w="2160"/>
+          </w:tcPr>
+          <w:p>
+            <w:r>
+              <w:t>Privacy-preserving and label-free, but with lower reported performance (over 80%) than supervised approaches such as ours.</w:t>
+            </w:r>
+          </w:p>
+        </w:tc>
+      </w:tr>
+      <w:tr>
+        <w:tc>
+          <w:tcPr>
+            <w:tcW w:type="dxa" w:w="1440"/>
+          </w:tcPr>
+          <w:p>
+            <w:r>
+              <w:t>9. Distributed federated learning for vehicles. Read: arXiv abstract</w:t>
+            </w:r>
+          </w:p>
+        </w:tc>
+        <w:tc>
+          <w:tcPr>
+            <w:tcW w:type="dxa" w:w="2160"/>
+          </w:tcPr>
+          <w:p>
+            <w:r>
+              <w:t>U. Demir, Y. E. Sagduyu, T. Erpek, H. Jafari, S. Kompella, M. Xue, 2025. arXiv 2505.23706 preprint</w:t>
+            </w:r>
+          </w:p>
+        </w:tc>
+        <w:tc>
+          <w:tcPr>
+            <w:tcW w:type="dxa" w:w="2304"/>
+          </w:tcPr>
+          <w:p>
+            <w:r>
+              <w:t>Study distributed federated learning for classifying safety messages, and its resilience to attack.</w:t>
+            </w:r>
+          </w:p>
+        </w:tc>
+        <w:tc>
+          <w:tcPr>
+            <w:tcW w:type="dxa" w:w="2304"/>
+          </w:tcPr>
+          <w:p>
+            <w:r>
+              <w:t>Vehicles share model updates with one-hop neighbours and propagate them over several hops.</w:t>
+            </w:r>
+          </w:p>
+        </w:tc>
+        <w:tc>
+          <w:tcPr>
+            <w:tcW w:type="dxa" w:w="2880"/>
+          </w:tcPr>
+          <w:p>
+            <w:r>
+              <w:t>Quantitative on VeReMi Extension; jamming and training-data poisoning studied. Sample sizes not stated.</w:t>
+            </w:r>
+          </w:p>
+        </w:tc>
+        <w:tc>
+          <w:tcPr>
+            <w:tcW w:type="dxa" w:w="2880"/>
+          </w:tcPr>
+          <w:p>
+            <w:r>
+              <w:t>Collaboration improves accuracy over local-only learning, especially for weak vehicles; accuracy depends on local data size and connectivity; vulnerable to multi-domain attacks.</w:t>
+            </w:r>
+          </w:p>
+        </w:tc>
+        <w:tc>
+          <w:tcPr>
+            <w:tcW w:type="dxa" w:w="2592"/>
+          </w:tcPr>
+          <w:p>
+            <w:r>
+              <w:t>No exact numbers on the page; calls for more robust federated-learning security.</w:t>
+            </w:r>
+          </w:p>
+        </w:tc>
+        <w:tc>
+          <w:tcPr>
+            <w:tcW w:type="dxa" w:w="2160"/>
+          </w:tcPr>
+          <w:p>
+            <w:r>
+              <w:t>Shows neighbours help training; ours uses neighbours at detection time. Also shows neighbour-based schemes can be attacked (poisoning).</w:t>
+            </w:r>
+          </w:p>
+        </w:tc>
+      </w:tr>
+      <w:tr>
+        <w:tc>
+          <w:tcPr>
+            <w:tcW w:type="dxa" w:w="1440"/>
+          </w:tcPr>
+          <w:p>
+            <w:r>
+              <w:t>10. ADVENT (federated, DoS). Read: search listing only</w:t>
+            </w:r>
+          </w:p>
+        </w:tc>
+        <w:tc>
+          <w:tcPr>
+            <w:tcW w:type="dxa" w:w="2160"/>
+          </w:tcPr>
+          <w:p>
+            <w:r>
+              <w:t>CNSM 2024 (authors not captured; ifip.org paper 1571071980)</w:t>
+            </w:r>
+          </w:p>
+        </w:tc>
+        <w:tc>
+          <w:tcPr>
+            <w:tcW w:type="dxa" w:w="2304"/>
+          </w:tcPr>
+          <w:p>
+            <w:r>
+              <w:t>Federated-learning detection of (D)DoS attacks, with a time-slicing step to improve false positives.</w:t>
+            </w:r>
+          </w:p>
+        </w:tc>
+        <w:tc>
+          <w:tcPr>
+            <w:tcW w:type="dxa" w:w="2304"/>
+          </w:tcPr>
+          <w:p>
+            <w:r>
+              <w:t>Federated learning with time-slicing in malicious-node detection.</w:t>
+            </w:r>
+          </w:p>
+        </w:tc>
+        <w:tc>
+          <w:tcPr>
+            <w:tcW w:type="dxa" w:w="2880"/>
+          </w:tcPr>
+          <w:p>
+            <w:r>
+              <w:t>Quantitative on VeReMi-Extension, five (D)DoS attack types.</w:t>
+            </w:r>
+          </w:p>
+        </w:tc>
+        <w:tc>
+          <w:tcPr>
+            <w:tcW w:type="dxa" w:w="2880"/>
+          </w:tcPr>
+          <w:p>
+            <w:r>
+              <w:t>Time slicing improves false-positive rate and F1 per the listing.</w:t>
+            </w:r>
+          </w:p>
+        </w:tc>
+        <w:tc>
+          <w:tcPr>
+            <w:tcW w:type="dxa" w:w="2592"/>
+          </w:tcPr>
+          <w:p>
+            <w:r>
+              <w:t>Full paper not read; exact numbers unverified.</w:t>
+            </w:r>
+          </w:p>
+        </w:tc>
+        <w:tc>
+          <w:tcPr>
+            <w:tcW w:type="dxa" w:w="2160"/>
+          </w:tcPr>
+          <w:p>
+            <w:r>
+              <w:t>Covers DoS attacks, which we have not yet tested.</w:t>
+            </w:r>
+          </w:p>
+        </w:tc>
+      </w:tr>
+      <w:tr>
+        <w:tc>
+          <w:tcPr>
+            <w:tcW w:type="dxa" w:w="1440"/>
+          </w:tcPr>
+          <w:p>
+            <w:r>
+              <w:t>11. TASER (trust-aware Sybil detection). Read: arXiv abstract</w:t>
+            </w:r>
+          </w:p>
+        </w:tc>
+        <w:tc>
+          <w:tcPr>
+            <w:tcW w:type="dxa" w:w="2160"/>
+          </w:tcPr>
+          <w:p>
+            <w:r>
+              <w:t>M. Thomas, A. Borah, A. Paranjothi, 2024. Internet Technology Letters (arXiv 2411.07520)</w:t>
+            </w:r>
+          </w:p>
+        </w:tc>
+        <w:tc>
+          <w:tcPr>
+            <w:tcW w:type="dxa" w:w="2304"/>
+          </w:tcPr>
+          <w:p>
+            <w:r>
+              <w:t>Detect Sybil attacks that falsify neighbouring traffic information.</w:t>
+            </w:r>
+          </w:p>
+        </w:tc>
+        <w:tc>
+          <w:tcPr>
+            <w:tcW w:type="dxa" w:w="2304"/>
+          </w:tcPr>
+          <w:p>
+            <w:r>
+              <w:t>Cumulative per-vehicle trust metric; low-trust vehicles statistically tested and GPS-verified with directional antennas; no roadside infrastructure.</w:t>
+            </w:r>
+          </w:p>
+        </w:tc>
+        <w:tc>
+          <w:tcPr>
+            <w:tcW w:type="dxa" w:w="2880"/>
+          </w:tcPr>
+          <w:p>
+            <w:r>
+              <w:t>Quantitative in OMNeT++/SUMO/VEINS simulation with up to 30% Sybil nodes.</w:t>
+            </w:r>
+          </w:p>
+        </w:tc>
+        <w:tc>
+          <w:tcPr>
+            <w:tcW w:type="dxa" w:w="2880"/>
+          </w:tcPr>
+          <w:p>
+            <w:r>
+              <w:t>Detection time cut by up to 66% in urban scenarios; accuracy varied by at most 3% across up to 30% Sybil nodes.</w:t>
+            </w:r>
+          </w:p>
+        </w:tc>
+        <w:tc>
+          <w:tcPr>
+            <w:tcW w:type="dxa" w:w="2592"/>
+          </w:tcPr>
+          <w:p>
+            <w:r>
+              <w:t>Not stated in the abstract (full paper not read).</w:t>
+            </w:r>
+          </w:p>
+        </w:tc>
+        <w:tc>
+          <w:tcPr>
+            <w:tcW w:type="dxa" w:w="2160"/>
+          </w:tcPr>
+          <w:p>
+            <w:r>
+              <w:t>Directly relevant to malicious neighbours; it uses trust over time and extra hardware, ours uses learned context only.</w:t>
+            </w:r>
+          </w:p>
+        </w:tc>
+      </w:tr>
+      <w:tr>
+        <w:tc>
+          <w:tcPr>
+            <w:tcW w:type="dxa" w:w="1440"/>
+          </w:tcPr>
+          <w:p>
+            <w:r>
+              <w:t>12. Sybil detection with DBSCAN. Read: arXiv abstract</w:t>
+            </w:r>
+          </w:p>
+        </w:tc>
+        <w:tc>
+          <w:tcPr>
+            <w:tcW w:type="dxa" w:w="2160"/>
+          </w:tcPr>
+          <w:p>
+            <w:r>
+              <w:t>M. S. T. Khan, M. S. A. Utsho, M. Jahan, 2026. arXiv 2606.11667 preprint</w:t>
+            </w:r>
+          </w:p>
+        </w:tc>
+        <w:tc>
+          <w:tcPr>
+            <w:tcW w:type="dxa" w:w="2304"/>
+          </w:tcPr>
+          <w:p>
+            <w:r>
+              <w:t>Fix high false positives, manual tuning and sparse-network weakness in VANET Sybil detection.</w:t>
+            </w:r>
+          </w:p>
+        </w:tc>
+        <w:tc>
+          <w:tcPr>
+            <w:tcW w:type="dxa" w:w="2304"/>
+          </w:tcPr>
+          <w:p>
+            <w:r>
+              <w:t>GPS trajectories clustered with DBSCAN (unsupervised parameter selection); no RSUs required.</w:t>
+            </w:r>
+          </w:p>
+        </w:tc>
+        <w:tc>
+          <w:tcPr>
+            <w:tcW w:type="dxa" w:w="2880"/>
+          </w:tcPr>
+          <w:p>
+            <w:r>
+              <w:t>Quantitative; dataset and sample sizes not stated on the page.</w:t>
+            </w:r>
+          </w:p>
+        </w:tc>
+        <w:tc>
+          <w:tcPr>
+            <w:tcW w:type="dxa" w:w="2880"/>
+          </w:tcPr>
+          <w:p>
+            <w:r>
+              <w:t>False-positive rate down about 72%, detection rate 99% in sparse regions; detection time down 76% (dense) and 43% (sparse).</w:t>
+            </w:r>
+          </w:p>
+        </w:tc>
+        <w:tc>
+          <w:tcPr>
+            <w:tcW w:type="dxa" w:w="2592"/>
+          </w:tcPr>
+          <w:p>
+            <w:r>
+              <w:t>Not stated in the abstract (full paper not read).</w:t>
+            </w:r>
+          </w:p>
+        </w:tc>
+        <w:tc>
+          <w:tcPr>
+            <w:tcW w:type="dxa" w:w="2160"/>
+          </w:tcPr>
+          <w:p>
+            <w:r>
+              <w:t>Sybil attacks are on our to-test list; shows false-positive rate and detection time are standard comparison metrics.</w:t>
+            </w:r>
+          </w:p>
+        </w:tc>
+      </w:tr>
+      <w:tr>
+        <w:tc>
+          <w:tcPr>
+            <w:tcW w:type="dxa" w:w="1440"/>
+          </w:tcPr>
+          <w:p>
+            <w:r>
+              <w:t>13. Data-centric misbehavior detection. Read: arXiv abstract</w:t>
+            </w:r>
+          </w:p>
+        </w:tc>
+        <w:tc>
+          <w:tcPr>
+            <w:tcW w:type="dxa" w:w="2160"/>
+          </w:tcPr>
+          <w:p>
+            <w:r>
+              <w:t>S. Ruj, M. A. Cavenaghi, Z. Huang, A. Nayak, I. Stojmenovic, 2011. arXiv 1103.2404</w:t>
+            </w:r>
+          </w:p>
+        </w:tc>
+        <w:tc>
+          <w:tcPr>
+            <w:tcW w:type="dxa" w:w="2304"/>
+          </w:tcPr>
+          <w:p>
+            <w:r>
+              <w:t>Argue that detecting false information matters more than identifying misbehaving nodes.</w:t>
+            </w:r>
+          </w:p>
+        </w:tc>
+        <w:tc>
+          <w:tcPr>
+            <w:tcW w:type="dxa" w:w="2304"/>
+          </w:tcPr>
+          <w:p>
+            <w:r>
+              <w:t>Each node judges received data by consistency with reported and estimated positions; no voting; fines by the certification authority.</w:t>
+            </w:r>
+          </w:p>
+        </w:tc>
+        <w:tc>
+          <w:tcPr>
+            <w:tcW w:type="dxa" w:w="2880"/>
+          </w:tcPr>
+          <w:p>
+            <w:r>
+              <w:t>Method and simulation details not stated on the page.</w:t>
+            </w:r>
+          </w:p>
+        </w:tc>
+        <w:tc>
+          <w:tcPr>
+            <w:tcW w:type="dxa" w:w="2880"/>
+          </w:tcPr>
+          <w:p>
+            <w:r>
+              <w:t>Qualitative: resilient to Sybil attacks by design; lower cost than credential revocation.</w:t>
+            </w:r>
+          </w:p>
+        </w:tc>
+        <w:tc>
+          <w:tcPr>
+            <w:tcW w:type="dxa" w:w="2592"/>
+          </w:tcPr>
+          <w:p>
+            <w:r>
+              <w:t>Not stated in the abstract (full paper not read).</w:t>
+            </w:r>
+          </w:p>
+        </w:tc>
+        <w:tc>
+          <w:tcPr>
+            <w:tcW w:type="dxa" w:w="2160"/>
+          </w:tcPr>
+          <w:p>
+            <w:r>
+              <w:t>Early example of judging data, not nodes, by consistency, the idea our window model learns.</w:t>
+            </w:r>
+          </w:p>
+        </w:tc>
+      </w:tr>
+      <w:tr>
+        <w:tc>
+          <w:tcPr>
+            <w:tcW w:type="dxa" w:w="1440"/>
+          </w:tcPr>
+          <w:p>
+            <w:r>
+              <w:t>14. Collusion in trust schemes. Read: search summary only (secondary)</w:t>
+            </w:r>
+          </w:p>
+        </w:tc>
+        <w:tc>
+          <w:tcPr>
+            <w:tcW w:type="dxa" w:w="2160"/>
+          </w:tcPr>
+          <w:p>
+            <w:r>
+              <w:t>Bissmeyer et al., 2012 (conference paper; title not captured)</w:t>
+            </w:r>
+          </w:p>
+        </w:tc>
+        <w:tc>
+          <w:tcPr>
+            <w:tcW w:type="dxa" w:w="2304"/>
+          </w:tcPr>
+          <w:p>
+            <w:r>
+              <w:t>Study when reputation schemes break under coordinated reports.</w:t>
+            </w:r>
+          </w:p>
+        </w:tc>
+        <w:tc>
+          <w:tcPr>
+            <w:tcW w:type="dxa" w:w="2304"/>
+          </w:tcPr>
+          <w:p>
+            <w:r>
+              <w:t>Central trust-and-reputation scheme with neighbours reporting.</w:t>
+            </w:r>
+          </w:p>
+        </w:tc>
+        <w:tc>
+          <w:tcPr>
+            <w:tcW w:type="dxa" w:w="2880"/>
+          </w:tcPr>
+          <w:p>
+            <w:r>
+              <w:t>Simulation; details not read.</w:t>
+            </w:r>
+          </w:p>
+        </w:tc>
+        <w:tc>
+          <w:tcPr>
+            <w:tcW w:type="dxa" w:w="2880"/>
+          </w:tcPr>
+          <w:p>
+            <w:r>
+              <w:t>Needs a majority of honest reporters; per the summary, 37% cooperating neighbours can obfuscate an attack.</w:t>
+            </w:r>
+          </w:p>
+        </w:tc>
+        <w:tc>
+          <w:tcPr>
+            <w:tcW w:type="dxa" w:w="2592"/>
+          </w:tcPr>
+          <w:p>
+            <w:r>
+              <w:t>Original not read; figure unverified.</w:t>
+            </w:r>
+          </w:p>
+        </w:tc>
+        <w:tc>
+          <w:tcPr>
+            <w:tcW w:type="dxa" w:w="2160"/>
+          </w:tcPr>
+          <w:p>
+            <w:r>
+              <w:t>Relevant to your professor's point: we should test colluding attackers, which our data does not contain.</w:t>
+            </w:r>
+          </w:p>
+        </w:tc>
+      </w:tr>
+      <w:tr>
+        <w:tc>
+          <w:tcPr>
+            <w:tcW w:type="dxa" w:w="1440"/>
+          </w:tcPr>
+          <w:p>
+            <w:r>
+              <w:t>15. Reputation + ML detector. Read: survey text only (secondary)</w:t>
+            </w:r>
+          </w:p>
+        </w:tc>
+        <w:tc>
+          <w:tcPr>
+            <w:tcW w:type="dxa" w:w="2160"/>
+          </w:tcPr>
+          <w:p>
+            <w:r>
+              <w:t>S. Gyawali, Y. Qian, R. Q. Hu, cited in the 2025 survey</w:t>
+            </w:r>
+          </w:p>
+        </w:tc>
+        <w:tc>
+          <w:tcPr>
+            <w:tcW w:type="dxa" w:w="2304"/>
+          </w:tcPr>
+          <w:p>
+            <w:r>
+              <w:t>Detect internal attackers using ML and reputation scores.</w:t>
+            </w:r>
+          </w:p>
+        </w:tc>
+        <w:tc>
+          <w:tcPr>
+            <w:tcW w:type="dxa" w:w="2304"/>
+          </w:tcPr>
+          <w:p>
+            <w:r>
+              <w:t>ML classification with Dempster-Shafer reputation synchronised with a Certificate Authority.</w:t>
+            </w:r>
+          </w:p>
+        </w:tc>
+        <w:tc>
+          <w:tcPr>
+            <w:tcW w:type="dxa" w:w="2880"/>
+          </w:tcPr>
+          <w:p>
+            <w:r>
+              <w:t>Quantitative; sample size not given in the survey.</w:t>
+            </w:r>
+          </w:p>
+        </w:tc>
+        <w:tc>
+          <w:tcPr>
+            <w:tcW w:type="dxa" w:w="2880"/>
+          </w:tcPr>
+          <w:p>
+            <w:r>
+              <w:t>Survey reports F1 98% for positional attacks.</w:t>
+            </w:r>
+          </w:p>
+        </w:tc>
+        <w:tc>
+          <w:tcPr>
+            <w:tcW w:type="dxa" w:w="2592"/>
+          </w:tcPr>
+          <w:p>
+            <w:r>
+              <w:t>Original not read; split and setup unknown.</w:t>
             </w:r>
           </w:p>
         </w:tc>
@@ -496,7 +1398,7 @@
           </w:tcPr>
           <w:p>
             <w:r>
-              <w:t>Study [secondary]</w:t>
+              <w:t>16. Physical-layer plausibility tests. Read: survey text only (secondary)</w:t>
             </w:r>
           </w:p>
         </w:tc>
@@ -506,7 +1408,7 @@
           </w:tcPr>
           <w:p>
             <w:r>
-              <w:t>Authors not named in the passage I read; cited in the survey</w:t>
+              <w:t>Authors not named in the survey passage</w:t>
             </w:r>
           </w:p>
         </w:tc>
@@ -516,7 +1418,7 @@
           </w:tcPr>
           <w:p>
             <w:r>
-              <w:t>Plausibility tests at the physical layer (First-, Majority-, Weighted-BSM).</w:t>
+              <w:t>Plausibility checks at the physical layer (First-, Majority-, Weighted-BSM).</w:t>
             </w:r>
           </w:p>
         </w:tc>
@@ -526,7 +1428,7 @@
           </w:tcPr>
           <w:p>
             <w:r>
-              <w:t>Rule-based plausibility checks.</w:t>
+              <w:t>Rule-based plausibility tests.</w:t>
             </w:r>
           </w:p>
         </w:tc>
@@ -546,7 +1448,7 @@
           </w:tcPr>
           <w:p>
             <w:r>
-              <w:t>Precision 95.91%, detection rate 83.73%. Physical-layer checks beat application-layer checks.</w:t>
+              <w:t>Precision 95.91%, detection rate 83.73%; physical-layer checks beat application-layer checks.</w:t>
             </w:r>
           </w:p>
         </w:tc>
@@ -556,7 +1458,7 @@
           </w:tcPr>
           <w:p>
             <w:r>
-              <w:t>Not read in the original. Recall is much lower than ours (0.975).</w:t>
+              <w:t>Original not read.</w:t>
             </w:r>
           </w:p>
         </w:tc>
@@ -566,7 +1468,7 @@
           </w:tcPr>
           <w:p>
             <w:r>
-              <w:t>Shows rule-based checks trade recall for precision; ours improves recall at similar precision.</w:t>
+              <w:t>Rule-based checks give precision but lower recall; ours has recall 0.975 at precision 0.989.</w:t>
             </w:r>
           </w:p>
         </w:tc>
@@ -578,7 +1480,7 @@
           </w:tcPr>
           <w:p>
             <w:r>
-              <w:t>Study [secondary]</w:t>
+              <w:t>17. ML location-spoofing detectors. Read: survey text only (secondary)</w:t>
             </w:r>
           </w:p>
         </w:tc>
@@ -588,7 +1490,7 @@
           </w:tcPr>
           <w:p>
             <w:r>
-              <w:t>So et al.; Sharma et al., cited in the survey</w:t>
+              <w:t>So et al.; Sharma et al., cited in the 2025 survey</w:t>
             </w:r>
           </w:p>
         </w:tc>
@@ -628,7 +1530,7 @@
           </w:tcPr>
           <w:p>
             <w:r>
-              <w:t>ML beat traditional plausibility checks. Sharma et al. report gains from using successive messages.</w:t>
+              <w:t>ML beat plausibility checks; successive-message features help.</w:t>
             </w:r>
           </w:p>
         </w:tc>
@@ -638,7 +1540,7 @@
           </w:tcPr>
           <w:p>
             <w:r>
-              <w:t>Not read in the original. They treat each sender separately, with no neighbour context.</w:t>
+              <w:t>Originals not read; per-sender, with no neighbour context.</w:t>
             </w:r>
           </w:p>
         </w:tc>
@@ -648,7 +1550,7 @@
           </w:tcPr>
           <w:p>
             <w:r>
-              <w:t>These are our nearest relatives: learned, per-sender detectors, like our per-sender baseline.</w:t>
+              <w:t>Nearest relatives of our per-sender baseline.</w:t>
             </w:r>
           </w:p>
         </w:tc>
@@ -660,7 +1562,7 @@
           </w:tcPr>
           <w:p>
             <w:r>
-              <w:t>This work (in progress)</w:t>
+              <w:t>18. This work (in progress)</w:t>
             </w:r>
           </w:p>
         </w:tc>
@@ -700,7 +1602,7 @@
           </w:tcPr>
           <w:p>
             <w:r>
-              <w:t>Quantitative. VeReMi Extension RandomPos and ConstSpeed, ~100k windows (61.7k train, 26.3k test), 3 models x 3 seeds, train on first hour, test on later hour.</w:t>
+              <w:t>Quantitative. VeReMi Extension RandomPos and ConstSpeed (61.7k train, 26.3k test windows); 3 models x 3 seeds; train on first hour, test on later hour.</w:t>
             </w:r>
           </w:p>
         </w:tc>
@@ -710,7 +1612,7 @@
           </w:tcPr>
           <w:p>
             <w:r>
-              <w:t>Full model: F1 0.982 vs 0.973 per-sender; recall 0.975 vs 0.959; mean latency 0.15 s vs 0.70 s; recall holds at 0.97 with over half malicious neighbours.</w:t>
+              <w:t>Full model: F1 0.982 vs 0.973 per-sender; recall 0.975 vs 0.959; mean latency 0.15 s vs 0.70 s; recall stays about 0.97 with over half the neighbours malicious.</w:t>
             </w:r>
           </w:p>
         </w:tc>
@@ -720,7 +1622,7 @@
           </w:tcPr>
           <w:p>
             <w:r>
-              <w:t>Only 2 of ~20 attacks; simulated data; independent (non-colluding) attackers; ConstSpeed slightly worse with neighbours; no transfer test on benchmark yet.</w:t>
+              <w:t>Only 2 of about 20 attacks; simulated data; independent attackers; ConstSpeed slightly worse with neighbours; no transfer test yet.</w:t>
             </w:r>
           </w:p>
         </w:tc>
@@ -730,7 +1632,7 @@
           </w:tcPr>
           <w:p>
             <w:r>
-              <w:t>Gap we address: neighbour context plus robustness to malicious neighbours, with a full metric set. Next: more attacks, dense traffic, colluding attackers.</w:t>
+              <w:t>Gap: neighbour context plus robustness to malicious neighbours with a full metric set. Next: more attacks, dense traffic, colluding attackers.</w:t>
             </w:r>
           </w:p>
         </w:tc>

</xml_diff>

<commit_message>
Literature review: add 3 more sources (20 total, read depth noted)
Co-Authored-By: Claude Sonnet 5.5 <noreply@anthropic.com>
Claude-Session: https://claude.ai/code/session_01PXyVqdKG827WeN1ceWaNxA
</commit_message>
<xml_diff>
--- a/docs/literature_review.docx
+++ b/docs/literature_review.docx
@@ -12,7 +12,7 @@
     </w:p>
     <w:p>
       <w:r>
-        <w:t>Neighbourhood-aware misbehavior detection for V2X (VeReMi Extension benchmark). 17 sources. The first column states how much of each I actually read: most rows are from the abstract only, so verify details against the full paper before citing. Rows marked (secondary) or search-only are known second-hand.</w:t>
+        <w:t>Neighbourhood-aware misbehavior detection for V2X (VeReMi Extension benchmark). 20 sources. The first column states how much of each I actually read: most rows are from the abstract only, so verify details against the full paper before citing. Rows marked (secondary) or search-only are known second-hand.</w:t>
       </w:r>
     </w:p>
     <w:tbl>
@@ -1562,7 +1562,253 @@
           </w:tcPr>
           <w:p>
             <w:r>
-              <w:t>18. This work (in progress)</w:t>
+              <w:t>18. Survey of ML-based misbehavior detection for 5G/6G vehicles. Read: arXiv abstract</w:t>
+            </w:r>
+          </w:p>
+        </w:tc>
+        <w:tc>
+          <w:tcPr>
+            <w:tcW w:type="dxa" w:w="2160"/>
+          </w:tcPr>
+          <w:p>
+            <w:r>
+              <w:t>A. Boualouache, T. Engel, 2022. arXiv 2201.10500 preprint</w:t>
+            </w:r>
+          </w:p>
+        </w:tc>
+        <w:tc>
+          <w:tcPr>
+            <w:tcW w:type="dxa" w:w="2304"/>
+          </w:tcPr>
+          <w:p>
+            <w:r>
+              <w:t>Survey and classify ML-based misbehavior detection systems for V2X, with lessons for building, validating and deploying them.</w:t>
+            </w:r>
+          </w:p>
+        </w:tc>
+        <w:tc>
+          <w:tcPr>
+            <w:tcW w:type="dxa" w:w="2304"/>
+          </w:tcPr>
+          <w:p>
+            <w:r>
+              <w:t>Classification of ML-based MDSs from security and ML perspectives (structure not described on the page).</w:t>
+            </w:r>
+          </w:p>
+        </w:tc>
+        <w:tc>
+          <w:tcPr>
+            <w:tcW w:type="dxa" w:w="2880"/>
+          </w:tcPr>
+          <w:p>
+            <w:r>
+              <w:t>Qualitative literature survey; selection method and number of systems not stated on the page.</w:t>
+            </w:r>
+          </w:p>
+        </w:tc>
+        <w:tc>
+          <w:tcPr>
+            <w:tcW w:type="dxa" w:w="2880"/>
+          </w:tcPr>
+          <w:p>
+            <w:r>
+              <w:t>PKI alone cannot defend V2X, so complementary detection systems are needed; analysing existing ML-based MDSs is a research gap.</w:t>
+            </w:r>
+          </w:p>
+        </w:tc>
+        <w:tc>
+          <w:tcPr>
+            <w:tcW w:type="dxa" w:w="2592"/>
+          </w:tcPr>
+          <w:p>
+            <w:r>
+              <w:t>Open research and standardisation issues are mentioned but not listed on the page.</w:t>
+            </w:r>
+          </w:p>
+        </w:tc>
+        <w:tc>
+          <w:tcPr>
+            <w:tcW w:type="dxa" w:w="2160"/>
+          </w:tcPr>
+          <w:p>
+            <w:r>
+              <w:t>Supports our motivation; read the full text before quoting its taxonomy.</w:t>
+            </w:r>
+          </w:p>
+        </w:tc>
+      </w:tr>
+      <w:tr>
+        <w:tc>
+          <w:tcPr>
+            <w:tcW w:type="dxa" w:w="1440"/>
+          </w:tcPr>
+          <w:p>
+            <w:r>
+              <w:t>19. LSTM detector with platoon-dissolution protocol (MSc thesis). Read: arXiv abstract</w:t>
+            </w:r>
+          </w:p>
+        </w:tc>
+        <w:tc>
+          <w:tcPr>
+            <w:tcW w:type="dxa" w:w="2160"/>
+          </w:tcPr>
+          <w:p>
+            <w:r>
+              <w:t>M. Franceschini, 2024. arXiv 2411.07013 (Master's thesis 2023-24)</w:t>
+            </w:r>
+          </w:p>
+        </w:tc>
+        <w:tc>
+          <w:tcPr>
+            <w:tcW w:type="dxa" w:w="2304"/>
+          </w:tcPr>
+          <w:p>
+            <w:r>
+              <w:t>Detect and mitigate misleading vehicular messages in cooperative ITS.</w:t>
+            </w:r>
+          </w:p>
+        </w:tc>
+        <w:tc>
+          <w:tcPr>
+            <w:tcW w:type="dxa" w:w="2304"/>
+          </w:tcPr>
+          <w:p>
+            <w:r>
+              <w:t>LSTM-based misbehavior detector plus a defence protocol that dissolves the platoon on anomaly.</w:t>
+            </w:r>
+          </w:p>
+        </w:tc>
+        <w:tc>
+          <w:tcPr>
+            <w:tcW w:type="dxa" w:w="2880"/>
+          </w:tcPr>
+          <w:p>
+            <w:r>
+              <w:t>Quantitative: trained offline on VeReMi, tested in real time in a platooning scenario. Attacks and sample sizes not stated on the page.</w:t>
+            </w:r>
+          </w:p>
+        </w:tc>
+        <w:tc>
+          <w:tcPr>
+            <w:tcW w:type="dxa" w:w="2880"/>
+          </w:tcPr>
+          <w:p>
+            <w:r>
+              <w:t>Prevents nearly all accidents caused by misbehavior in the platoon test; detects misbehavior in general but struggles to label specific types.</w:t>
+            </w:r>
+          </w:p>
+        </w:tc>
+        <w:tc>
+          <w:tcPr>
+            <w:tcW w:type="dxa" w:w="2592"/>
+          </w:tcPr>
+          <w:p>
+            <w:r>
+              <w:t>Labelling specific misbehavior types is hard under varying traffic; needs more data and refinement.</w:t>
+            </w:r>
+          </w:p>
+        </w:tc>
+        <w:tc>
+          <w:tcPr>
+            <w:tcW w:type="dxa" w:w="2160"/>
+          </w:tcPr>
+          <w:p>
+            <w:r>
+              <w:t>Closest to your professor's crash scenario: it links detection to a safety action. We stop at detection and report latency.</w:t>
+            </w:r>
+          </w:p>
+        </w:tc>
+      </w:tr>
+      <w:tr>
+        <w:tc>
+          <w:tcPr>
+            <w:tcW w:type="dxa" w:w="1440"/>
+          </w:tcPr>
+          <w:p>
+            <w:r>
+              <w:t>20. Collective-perception misbehavior detection with a spatio-temporal GNN. Read: search listing only</w:t>
+            </w:r>
+          </w:p>
+        </w:tc>
+        <w:tc>
+          <w:tcPr>
+            <w:tcW w:type="dxa" w:w="2160"/>
+          </w:tcPr>
+          <w:p>
+            <w:r>
+              <w:t>PIMRC 2025 paper and synthetic dataset derived from BurST-ADMA (authors not captured)</w:t>
+            </w:r>
+          </w:p>
+        </w:tc>
+        <w:tc>
+          <w:tcPr>
+            <w:tcW w:type="dxa" w:w="2304"/>
+          </w:tcPr>
+          <w:p>
+            <w:r>
+              <w:t>State of the art and first synthetic dataset for misbehavior detection with collective perception in C-V2X.</w:t>
+            </w:r>
+          </w:p>
+        </w:tc>
+        <w:tc>
+          <w:tcPr>
+            <w:tcW w:type="dxa" w:w="2304"/>
+          </w:tcPr>
+          <w:p>
+            <w:r>
+              <w:t>Spatio-temporal graph neural network over the vehicles (per the listing).</w:t>
+            </w:r>
+          </w:p>
+        </w:tc>
+        <w:tc>
+          <w:tcPr>
+            <w:tcW w:type="dxa" w:w="2880"/>
+          </w:tcPr>
+          <w:p>
+            <w:r>
+              <w:t>Quantitative, synthetic collective-perception message dataset; details not read.</w:t>
+            </w:r>
+          </w:p>
+        </w:tc>
+        <w:tc>
+          <w:tcPr>
+            <w:tcW w:type="dxa" w:w="2880"/>
+          </w:tcPr>
+          <w:p>
+            <w:r>
+              <w:t>Not read.</w:t>
+            </w:r>
+          </w:p>
+        </w:tc>
+        <w:tc>
+          <w:tcPr>
+            <w:tcW w:type="dxa" w:w="2592"/>
+          </w:tcPr>
+          <w:p>
+            <w:r>
+              <w:t>Original not read.</w:t>
+            </w:r>
+          </w:p>
+        </w:tc>
+        <w:tc>
+          <w:tcPr>
+            <w:tcW w:type="dxa" w:w="2160"/>
+          </w:tcPr>
+          <w:p>
+            <w:r>
+              <w:t>A graph model over neighbouring vehicles, like our neighbour attention; a different message type (collective perception).</w:t>
+            </w:r>
+          </w:p>
+        </w:tc>
+      </w:tr>
+      <w:tr>
+        <w:tc>
+          <w:tcPr>
+            <w:tcW w:type="dxa" w:w="1440"/>
+          </w:tcPr>
+          <w:p>
+            <w:r>
+              <w:t>21. This work (in progress)</w:t>
             </w:r>
           </w:p>
         </w:tc>

</xml_diff>

<commit_message>
Correct dataset naming (VeReMi++ = Extension, 19 attacks) after reading papers; ignore local papers folder
Co-Authored-By: Claude Sonnet 5.5 <noreply@anthropic.com>
Claude-Session: https://claude.ai/code/session_01PXyVqdKG827WeN1ceWaNxA
</commit_message>
<xml_diff>
--- a/docs/literature_review.docx
+++ b/docs/literature_review.docx
@@ -290,7 +290,7 @@
           </w:tcPr>
           <w:p>
             <w:r>
-              <w:t>Quantitative. About 20 attack types (position, speed, delay, replay, DoS, Sybil, eventual stop), two time slots (07-09 h, 14-16 h), plus a full-day mixed set.</w:t>
+              <w:t>Quantitative. 19 attack types per the PAMPOS paper (position, speed, delay, replay, DoS, Sybil, eventual stop); some papers call it VeReMi++, two time slots (07-09 h, 14-16 h), plus a full-day mixed set.</w:t>
             </w:r>
           </w:p>
         </w:tc>
@@ -320,7 +320,7 @@
           </w:tcPr>
           <w:p>
             <w:r>
-              <w:t>The dataset we evaluate on (RandomPos and ConstSpeed so far).</w:t>
+              <w:t>The dataset we evaluate on (RandomPos and ConstSpeed so far, of its 19 attack types).</w:t>
             </w:r>
           </w:p>
         </w:tc>
@@ -578,7 +578,7 @@
           </w:tcPr>
           <w:p>
             <w:r>
-              <w:t>6. PAMPOS (attack-agnostic). Read: arXiv abstract</w:t>
+              <w:t>6. PAMPOS (attack-agnostic). Read: arXiv abstract; related-work section checked in the full PDF</w:t>
             </w:r>
           </w:p>
         </w:tc>
@@ -618,7 +618,7 @@
           </w:tcPr>
           <w:p>
             <w:r>
-              <w:t>Quantitative on VeReMi++ (as named on its page), benign training only, 19 attack types, rush-hour and afternoon. Sample sizes not stated.</w:t>
+              <w:t>Quantitative on VeReMi++ (= the VeReMi Extension dataset, Kamel et al.; 24-hour simulations), benign-only training, all 19 attack types, rush-hour and afternoon. Sample sizes not stated on the page.</w:t>
             </w:r>
           </w:p>
         </w:tc>
@@ -648,7 +648,7 @@
           </w:tcPr>
           <w:p>
             <w:r>
-              <w:t>Complements us: unsupervised and attack-agnostic, where ours is supervised. Our F1 (0.982) is on 2 attacks, theirs on 19, so not comparable.</w:t>
+              <w:t>Complements us: unsupervised and attack-agnostic, where ours is supervised. Its related work also mentions AIMformer (a supervised transformer by the same group). Our F1 (0.982) is on 2 attacks, theirs on 19, so not comparable.</w:t>
             </w:r>
           </w:p>
         </w:tc>
@@ -700,7 +700,7 @@
           </w:tcPr>
           <w:p>
             <w:r>
-              <w:t>Quantitative on VeReMi BSM sequences, a selected attack set; baselines LLAMA2-7B and RoBERTa. Sample sizes not stated.</w:t>
+              <w:t>Quantitative on the extended VeReMi (Extension) dataset, BSM sequences, a selected attack set; baselines LLAMA2-7B and RoBERTa. Sample sizes not stated.</w:t>
             </w:r>
           </w:p>
         </w:tc>
@@ -1868,7 +1868,7 @@
           </w:tcPr>
           <w:p>
             <w:r>
-              <w:t>Only 2 of about 20 attacks; simulated data; independent attackers; ConstSpeed slightly worse with neighbours; no transfer test yet.</w:t>
+              <w:t>Only 2 of 19 attacks; simulated data; independent attackers; ConstSpeed slightly worse with neighbours; no transfer test yet.</w:t>
             </w:r>
           </w:p>
         </w:tc>

</xml_diff>

<commit_message>
Finish documents: final numbers in deck, blueprint, worksheet, plan, literature table; paper fact-check fixes
- presentation: build_deck.js updated and progress_update.pptx rebuilt (9 slides,
  final 14-attack and v2 results, no preliminary numbers left)
- docs: blueprint and worksheet (1 page each), research plan and literature
  review regenerated with final results; worksheet Q2 marked as draft
- paper: fixes from an independent fact-check against results/*.json (seed
  means, same-label comparisons, memory qualifier, softened impossibility and
  GPS claims, single-seed note in the trajectory table)
- README: wording and pointers updated

Co-Authored-By: Claude Opus 5.5 <noreply@anthropic.com>
</commit_message>
<xml_diff>
--- a/docs/literature_review.docx
+++ b/docs/literature_review.docx
@@ -260,7 +260,7 @@
           </w:tcPr>
           <w:p>
             <w:r>
-              <w:t>J. Kamel, R. W. van der Heijden et al., 2020. IEEE ICC</w:t>
+              <w:t>J. Kamel, M. Wolf, R. W. van der Heijden, A. Kaiser, P. Urien, F. Kargl, 2020. IEEE ICC 2020 (doi 10.1109/ICC40277.2020.9149132)</w:t>
             </w:r>
           </w:p>
         </w:tc>
@@ -320,7 +320,7 @@
           </w:tcPr>
           <w:p>
             <w:r>
-              <w:t>The dataset we evaluate on (RandomPos and ConstSpeed so far, of its 19 attack types).</w:t>
+              <w:t>The dataset we evaluate on (14 of its 19 attack types; Sybil not yet covered, RandomSpeedOffset archive excluded as mislabeled). Simulated benchmark, not real-world data.</w:t>
             </w:r>
           </w:p>
         </w:tc>
@@ -414,7 +414,7 @@
           </w:tcPr>
           <w:p>
             <w:r>
-              <w:t>4. Survey of V2X intrusion detection. Read: full text (searched)</w:t>
+              <w:t>4. Survey of V2X intrusion detection (project reference / base paper). Read: full text</w:t>
             </w:r>
           </w:p>
         </w:tc>
@@ -424,7 +424,7 @@
           </w:tcPr>
           <w:p>
             <w:r>
-              <w:t>S. A. Abdel Hakeem, H. Kim, 2025. IEEE Trans. Intelligent Transportation Systems 26(8)</w:t>
+              <w:t>S. A. Abdel Hakeem, H. Kim, 2025. IEEE Trans. Intelligent Transportation Systems 26(8), pp. 11137-11205</w:t>
             </w:r>
           </w:p>
         </w:tc>
@@ -464,7 +464,7 @@
           </w:tcPr>
           <w:p>
             <w:r>
-              <w:t>Cooperative detectors often assume an honest majority and fail against collusion. Datasets lack attack diversity and real-world data.</w:t>
+              <w:t>Cooperative detectors often assume an honest majority and fail against collusion. Datasets lack attack diversity and real-world data. Table XIII reports 97.37% for VeReMi (accuracy, precision, recall and F1 lumped into one figure, on the original VeReMi with 5 attacks; the source of the figure is not cited).</w:t>
             </w:r>
           </w:p>
         </w:tc>
@@ -474,7 +474,7 @@
           </w:tcPr>
           <w:p>
             <w:r>
-              <w:t>Wrongly describes VeReMi as a mix of real and synthetic data; it is fully simulated. No per-dataset result tables I could read.</w:t>
+              <w:t>Wrongly describes VeReMi as a mix of real and synthetic data; it is fully simulated. The 97.37% figure has no cited source and lumps four metrics together.</w:t>
             </w:r>
           </w:p>
         </w:tc>
@@ -484,7 +484,7 @@
           </w:tcPr>
           <w:p>
             <w:r>
-              <w:t>Motivates our malicious-neighbour test and our metric set including latency.</w:t>
+              <w:t>Our reference (base) paper. Motivates our malicious-neighbour and collusion tests and our metric set including latency. Our v2 + memory beats 97.37% on all four metrics under message labels (P 98.16, R 97.78, F1 97.97, Acc 98.74); under vehicle labels recall and F1 do not. Not a like-for-like comparison (different VeReMi version and attacks).</w:t>
             </w:r>
           </w:p>
         </w:tc>
@@ -506,7 +506,7 @@
           </w:tcPr>
           <w:p>
             <w:r>
-              <w:t>H. Li, K. Kalogiannis, A. M. Hussain, P. Papadimitratos, 2025. ACM WiseML 2025 (arXiv 2505.10273)</w:t>
+              <w:t>Hexu Li, K. Kalogiannis, A. M. Hussain, P. Papadimitratos, 2025. "AttentionGuard: Transformer-based Misbehavior Detection for Secure Vehicular Platoons". ACM WiseML 2025 (arXiv 2505.10273)</w:t>
             </w:r>
           </w:p>
         </w:tc>
@@ -588,7 +588,7 @@
           </w:tcPr>
           <w:p>
             <w:r>
-              <w:t>K. Kalogiannis, A. M. Hussain, P. Papadimitratos, 2026. ACM WiseML 2026 (arXiv 2605.06833)</w:t>
+              <w:t>K. Kalogiannis, A. M. Hussain, P. Papadimitratos, 2026. "PAMPOS: Causal Transformer-based Trajectory Prediction for Attack-Agnostic Misbehavior Detection in V2X Networks". ACM WiseML 2026 (arXiv 2605.06833)</w:t>
             </w:r>
           </w:p>
         </w:tc>
@@ -648,7 +648,7 @@
           </w:tcPr>
           <w:p>
             <w:r>
-              <w:t>Complements us: unsupervised and attack-agnostic, where ours is supervised. Its related work also mentions AIMformer (a supervised transformer by the same group). Our F1 (0.982) is on 2 attacks, theirs on 19, so not comparable.</w:t>
+              <w:t>Complements us: unsupervised and attack-agnostic, where ours is supervised. Its related work also mentions AIMformer (a supervised transformer by the same group). Our F1 (97.88 message labels, 97.01 vehicle labels) is supervised on 14 of 19 attacks, theirs unsupervised on 19, so not directly comparable.</w:t>
             </w:r>
           </w:p>
         </w:tc>
@@ -1386,7 +1386,7 @@
           </w:tcPr>
           <w:p>
             <w:r>
-              <w:t>Closest published number to our F1 (0.982) but not directly comparable.</w:t>
+              <w:t>Close to our F1 (97.88 message labels, 97.01 vehicle labels) but not directly comparable.</w:t>
             </w:r>
           </w:p>
         </w:tc>
@@ -1468,7 +1468,7 @@
           </w:tcPr>
           <w:p>
             <w:r>
-              <w:t>Rule-based checks give precision but lower recall; ours has recall 0.975 at precision 0.989.</w:t>
+              <w:t>Rule-based checks give precision but lower recall; our v2 has recall 97.12 at precision 98.65 (message labels). Our own speed-check rule reaches only F1 78.9 (vehicle labels).</w:t>
             </w:r>
           </w:p>
         </w:tc>
@@ -1808,7 +1808,7 @@
           </w:tcPr>
           <w:p>
             <w:r>
-              <w:t>21. This work (in progress)</w:t>
+              <w:t>21. This work (final)</w:t>
             </w:r>
           </w:p>
         </w:tc>
@@ -1818,7 +1818,7 @@
           </w:tcPr>
           <w:p>
             <w:r>
-              <w:t>Project team, 2026</w:t>
+              <w:t>Project team, 2026. IEEE conference paper (paper/main.pdf, 6 pages, 18 references)</w:t>
             </w:r>
           </w:p>
         </w:tc>
@@ -1828,7 +1828,7 @@
           </w:tcPr>
           <w:p>
             <w:r>
-              <w:t>Does looking at neighbouring senders improve detection, and does it hold up when neighbours are malicious?</w:t>
+              <w:t>Does looking at neighbouring senders improve misbehavior detection, and does it hold up when neighbours are malicious or colluding?</w:t>
             </w:r>
           </w:p>
         </w:tc>
@@ -1838,7 +1838,7 @@
           </w:tcPr>
           <w:p>
             <w:r>
-              <w:t>Factorised temporal + spatial transformer; per-sender and no-spatial ablations.</w:t>
+              <w:t>Small transformer (144k parameters) with temporal attention plus cross-sender (neighbour) attention. Inputs: 9 claim values plus 10 plausibility checks (kinematics, road map learned from honest traffic, nearest other claim, exact self-repeat, copied trail, log movement). Training adds careful injected lies (offset, fake stop). Optional receiver-side memory.</w:t>
             </w:r>
           </w:p>
         </w:tc>
@@ -1848,7 +1848,7 @@
           </w:tcPr>
           <w:p>
             <w:r>
-              <w:t>Quantitative. VeReMi Extension RandomPos and ConstSpeed (61.7k train, 26.3k test windows); 3 models x 3 seeds; train on first hour, test on later hour.</w:t>
+              <w:t>Quantitative. VeReMi Extension (simulated benchmark, Zenodo 20090854), 14 of 19 attack types (no Sybil; RandomSpeedOffset archive excluded as mislabeled). 109,823 train, 29,547 validation, 68,971 test windows; 2 seeds. Message labels and vehicle labels both reported. Collusion stress test at matched 1% FPR.</w:t>
             </w:r>
           </w:p>
         </w:tc>
@@ -1858,7 +1858,7 @@
           </w:tcPr>
           <w:p>
             <w:r>
-              <w:t>Full model: F1 0.982 vs 0.973 per-sender; recall 0.975 vs 0.959; mean latency 0.15 s vs 0.70 s; recall stays about 0.97 with over half the neighbours malicious.</w:t>
+              <w:t>v2, message labels: P 98.65, R 97.12, F1 97.88, Acc 98.69, FPR 0.60%; with memory F1 97.97, Acc 98.74. Vehicle labels: F1 97.01 (98.14 Acc); with memory 97.12. First model (no checks): F1 94.9; speed-check rule F1 78.9. Neighbour attention: +0.3 F1 (95% CI about [0.2, 0.4]), FPR 0.90% to 0.60%. Mean 0.9 s to first alarm (median 0); 96% of attacker-receiver pairs flagged. Collusion: colluder recall rose from at most 0.04 (first model) to 0.83-0.86 (50 m offset), about 0.70 (fake stop), 0.87-0.90 (unseen spoofed convoy).</w:t>
             </w:r>
           </w:p>
         </w:tc>
@@ -1868,7 +1868,7 @@
           </w:tcPr>
           <w:p>
             <w:r>
-              <w:t>Only 2 of 19 attacks; simulated data; independent attackers; ConstSpeed slightly worse with neighbours; no transfer test yet.</w:t>
+              <w:t>Simulated data only. Sybil not covered; 2 seeds only. Neighbour benefit shrinks and turns slightly negative when attackers are the majority of neighbours. Map-aware on-road lies still hard (offset along road 0.23-0.25, convoy on own road 0.36-0.48). Not yet checked on original VeReMi / NextGen or dense traffic.</w:t>
             </w:r>
           </w:p>
         </w:tc>
@@ -1878,7 +1878,7 @@
           </w:tcPr>
           <w:p>
             <w:r>
-              <w:t>Gap: neighbour context plus robustness to malicious neighbours with a full metric set. Next: more attacks, dense traffic, colluding attackers.</w:t>
+              <w:t>Gap filled: neighbour context plus plausibility checks with a full metric set and a collusion stress test. Beats the base paper's 97.37% on all four metrics under message labels only; not like-for-like. Next: Sybil, original VeReMi / NextGen, dense traffic, a 3rd seed, and an independent signal (signal strength, sensors, RSUs) for on-road consistent lies.</w:t>
             </w:r>
           </w:p>
         </w:tc>

</xml_diff>

<commit_message>
Add Sybil attacks: 18 of 19 attack types, pseudonym tracking, identity features
- loader tracks senders by pseudonym (what a receiver sees); labels from the
  true vehicle; identity age (chained across pseudonym changes), handover
  distance and lockstep inputs -> 22 inputs; windows of the 14 original
  attacks are unchanged
- label_active: ground truth keyed by vehicle; DoS Sybil variants count as
  active (FLOOD_EXTRA=18,19)
- training robustness: models saved before scoring, per-epoch checkpoints
  (EPOCH_CKPT), configurable width/depth (MODEL_D, MODEL_L)
- results: 18-attack 3-model ensemble, message labels P 96.30 R 95.46
  F1 95.88 Acc 97.04 (vehicle F1 95.38); GridSybil recall 0.82 is the weak
  spot; neighbour attention about +1.3 F1 on 18 attacks
- paper: Sybil extension section and table (6 pages, fact-checked);
  README, HANDOFF, deck, blueprint, worksheet, plan and literature table
  updated

Co-Authored-By: Claude Opus 5.5 <noreply@anthropic.com>
</commit_message>
<xml_diff>
--- a/docs/literature_review.docx
+++ b/docs/literature_review.docx
@@ -320,7 +320,7 @@
           </w:tcPr>
           <w:p>
             <w:r>
-              <w:t>The dataset we evaluate on (14 of its 19 attack types; Sybil not yet covered, RandomSpeedOffset archive excluded as mislabeled). Simulated benchmark, not real-world data.</w:t>
+              <w:t>The dataset we evaluate on (14 of its 19 attack types in the main study, 18 of 19 with the four Sybil attacks added; RandomSpeedOffset archive excluded as mislabeled). Simulated benchmark, not real-world data.</w:t>
             </w:r>
           </w:p>
         </w:tc>
@@ -484,7 +484,7 @@
           </w:tcPr>
           <w:p>
             <w:r>
-              <w:t>Our reference (base) paper. Motivates our malicious-neighbour and collusion tests and our metric set including latency. Our v2 + memory beats 97.37% on all four metrics under message labels (P 98.16, R 97.78, F1 97.97, Acc 98.74); under vehicle labels recall and F1 do not. Not a like-for-like comparison (different VeReMi version and attacks).</w:t>
+              <w:t>Our reference (base) paper. Motivates our malicious-neighbour and collusion tests and our metric set including latency. Our v2 + memory beats 97.37% on all four metrics under message labels (P 98.16, R 97.78, F1 97.97, Acc 98.74); under vehicle labels recall and F1 do not. On 18 attacks (Sybil added) all four are below 97.37 (P 96.3, R 95.5, F1 95.9, Acc 97.0). Not a like-for-like comparison (different VeReMi version and attacks).</w:t>
             </w:r>
           </w:p>
         </w:tc>
@@ -976,7 +976,7 @@
           </w:tcPr>
           <w:p>
             <w:r>
-              <w:t>Covers DoS attacks, which we have not yet tested.</w:t>
+              <w:t>Covers DoS attacks; we test DoS, DoSRandom, DoSDisruptive and their Sybil variants (recall 0.97-1.00 on message labels).</w:t>
             </w:r>
           </w:p>
         </w:tc>
@@ -1140,7 +1140,7 @@
           </w:tcPr>
           <w:p>
             <w:r>
-              <w:t>Sybil attacks are on our to-test list; shows false-positive rate and detection time are standard comparison metrics.</w:t>
+              <w:t>Uses trajectories, as we do; our 18-attack system tracks Sybil identities by pseudonym and still misses about 18% of GridSybil slots. Shows false-positive rate and detection time are standard comparison metrics.</w:t>
             </w:r>
           </w:p>
         </w:tc>
@@ -1838,7 +1838,7 @@
           </w:tcPr>
           <w:p>
             <w:r>
-              <w:t>Small transformer (144k parameters) with temporal attention plus cross-sender (neighbour) attention. Inputs: 9 claim values plus 10 plausibility checks (kinematics, road map learned from honest traffic, nearest other claim, exact self-repeat, copied trail, log movement). Training adds careful injected lies (offset, fake stop). Optional receiver-side memory.</w:t>
+              <w:t>Small transformer (144k parameters) with temporal attention plus cross-sender (neighbour) attention. Inputs: 9 claim values plus 10 plausibility checks (kinematics, road map learned from honest traffic, nearest other claim, exact self-repeat, copied trail, log movement). Training adds careful injected lies (offset, fake stop). Optional receiver-side memory. Sybil extension: senders tracked by pseudonym (all a receiver sees), 3 extra inputs (identity age, handover distance, lockstep; 22 in total), and a 3-model ensemble (two 144k-parameter seeds plus one wider/deeper model, mean score).</w:t>
             </w:r>
           </w:p>
         </w:tc>
@@ -1848,7 +1848,7 @@
           </w:tcPr>
           <w:p>
             <w:r>
-              <w:t>Quantitative. VeReMi Extension (simulated benchmark, Zenodo 20090854), 14 of 19 attack types (no Sybil; RandomSpeedOffset archive excluded as mislabeled). 109,823 train, 29,547 validation, 68,971 test windows; 2 seeds. Message labels and vehicle labels both reported. Collusion stress test at matched 1% FPR.</w:t>
+              <w:t>Quantitative. VeReMi Extension (simulated benchmark, Zenodo 20090854). Main study: 14 of 19 attack types, 109,823 train, 29,547 validation, 68,971 test windows; 2 seeds. Extension: 18 of 19 (adds GridSybil, DataReplaySybil, DoSRandomSybil, DoSDisruptiveSybil), 141,260 train (+51,033 augmented), 88,695 test windows. RandomSpeedOffset archive excluded as mislabeled. Message labels and vehicle labels both reported. Collusion stress test at matched 1% FPR.</w:t>
             </w:r>
           </w:p>
         </w:tc>
@@ -1858,7 +1858,7 @@
           </w:tcPr>
           <w:p>
             <w:r>
-              <w:t>v2, message labels: P 98.65, R 97.12, F1 97.88, Acc 98.69, FPR 0.60%; with memory F1 97.97, Acc 98.74. Vehicle labels: F1 97.01 (98.14 Acc); with memory 97.12. First model (no checks): F1 94.9; speed-check rule F1 78.9. Neighbour attention: +0.3 F1 (95% CI about [0.2, 0.4]), FPR 0.90% to 0.60%. Mean 0.9 s to first alarm (median 0); 96% of attacker-receiver pairs flagged. Collusion: colluder recall rose from at most 0.04 (first model) to 0.83-0.86 (50 m offset), about 0.70 (fake stop), 0.87-0.90 (unseen spoofed convoy).</w:t>
+              <w:t>v2, message labels: P 98.65, R 97.12, F1 97.88, Acc 98.69, FPR 0.60%; with memory F1 97.97, Acc 98.74. Vehicle labels: F1 97.01 (98.14 Acc); with memory 97.12. First model (no checks): F1 94.9; speed-check rule F1 78.9. Neighbour attention: +0.3 F1 (95% CI about [0.2, 0.4]), FPR 0.90% to 0.60%. Mean 0.9 s to first alarm (median 0); 96% of attacker-receiver pairs flagged. Collusion: colluder recall rose from at most 0.04 (first model) to 0.83-0.86 (50 m offset), about 0.70 (fake stop), 0.87-0.90 (unseen spoofed convoy). 18 attacks (Sybil added), message labels: P 96.30, R 95.46, F1 95.88, Acc 97.04, FPR 2.07%; vehicle labels: P 96.33, R 94.44, F1 95.38, Acc 96.66. Neighbour attention adds about 1.4 F1 here (no-neighbour F1 94.45 / 93.94). Recall: DoSRandomSybil 0.997, DoSDisruptiveSybil 0.969, DataReplaySybil 0.914, GridSybil 0.823.</w:t>
             </w:r>
           </w:p>
         </w:tc>
@@ -1868,7 +1868,7 @@
           </w:tcPr>
           <w:p>
             <w:r>
-              <w:t>Simulated data only. Sybil not covered; 2 seeds only. Neighbour benefit shrinks and turns slightly negative when attackers are the majority of neighbours. Map-aware on-road lies still hard (offset along road 0.23-0.25, convoy on own road 0.36-0.48). Not yet checked on original VeReMi / NextGen or dense traffic.</w:t>
+              <w:t>Simulated data only. 2 seeds only (main study). GridSybil is the weakest attack: missed fake identities look honest on every content check, and no timing or formation cue separated them, so an independent signal is needed. With Sybil the FPR rises to 2.07% (about 1.6% on the 14 original attack runs, vs 0.6% for the 14-attack model). Bigger model alone and receiver memory did not help. Neighbour benefit shrinks and turns slightly negative when attackers are the majority of neighbours. Map-aware on-road lies still hard (offset along road 0.23-0.25, convoy on own road 0.36-0.48). Not yet checked on original VeReMi / NextGen or dense traffic.</w:t>
             </w:r>
           </w:p>
         </w:tc>
@@ -1878,7 +1878,7 @@
           </w:tcPr>
           <w:p>
             <w:r>
-              <w:t>Gap filled: neighbour context plus plausibility checks with a full metric set and a collusion stress test. Beats the base paper's 97.37% on all four metrics under message labels only; not like-for-like. Next: Sybil, original VeReMi / NextGen, dense traffic, a 3rd seed, and an independent signal (signal strength, sensors, RSUs) for on-road consistent lies.</w:t>
+              <w:t>Gap filled: neighbour context plus plausibility checks with a full metric set and a collusion stress test. Beats the base paper's 97.37% on all four metrics under message labels with 14 attacks; on 18 attacks (with Sybil) all four are below it (P 96.3, R 95.5, F1 95.9, Acc 97.0). Not like-for-like either way. Next: original VeReMi / NextGen, dense traffic, a 3rd seed, and an independent signal (signal strength, sensors, RSUs) for on-road consistent lies.</w:t>
             </w:r>
           </w:p>
         </w:tc>

</xml_diff>